<commit_message>
Mark Impulsión Falabella active from 11 Aug 2026 in PA fichas
MAM ficha now treats 000025-09 as an operating point (OC/equipment
change), with first-days volumes and night profile. The 7 Malls PPT
is unchanged.

Co-authored-by: anibaloperacionesWes <anibaloperacionesWes@users.noreply.github.com>
</commit_message>
<xml_diff>
--- a/reports/Parque_Arauco/TMP_7MALLS/entrega_diego_anibal/Fichas_ejecutivas_Parque_Arauco_20260814.docx
+++ b/reports/Parque_Arauco/TMP_7MALLS/entrega_diego_anibal/Fichas_ejecutivas_Parque_Arauco_20260814.docx
@@ -203,7 +203,7 @@
           <w:color w:val="0D3B66"/>
           <w:sz w:val="22"/>
         </w:rPr>
-        <w:t>Agosto 1–14: 1.322,9 m³  (94,5 m³/día)</w:t>
+        <w:t>Agosto 1–14: 1.376,9 m³  (98,3 m³/día)</w:t>
       </w:r>
     </w:p>
     <w:p>
@@ -217,7 +217,7 @@
           <w:color w:val="0D3B66"/>
           <w:sz w:val="22"/>
         </w:rPr>
-        <w:t>Proyección agosto: 2.929,3 m³</w:t>
+        <w:t>Proyección agosto: 3.048,8 m³</w:t>
       </w:r>
     </w:p>
     <w:p>
@@ -231,7 +231,7 @@
           <w:color w:val="0D3B66"/>
           <w:sz w:val="22"/>
         </w:rPr>
-        <w:t>Mayor aporte: Sala de Bomba Estanque Sur — jun 1.365,2 / jul 801,9 / ago 411 m³</w:t>
+        <w:t>Mayor aporte: Sala de Bomba Estanque Sur — jun 1.365,2 / jul 801,9 / ago 431,8 m³</w:t>
       </w:r>
     </w:p>
     <w:p>
@@ -245,7 +245,21 @@
           <w:color w:val="0D3B66"/>
           <w:sz w:val="22"/>
         </w:rPr>
-        <w:t>Variación m³/día: jul vs jun -6%  ·  ago vs jul -5%</w:t>
+        <w:t>Variación m³/día: jul vs jun -6%  ·  ago vs jul -1%</w:t>
+      </w:r>
+    </w:p>
+    <w:p>
+      <w:pPr>
+        <w:pStyle w:val="ListBullet"/>
+        <w:spacing w:after="80" w:before="0"/>
+      </w:pPr>
+      <w:r>
+        <w:rPr>
+          <w:rFonts w:ascii="Calibri" w:hAnsi="Calibri"/>
+          <w:color w:val="0D3B66"/>
+          <w:sz w:val="22"/>
+        </w:rPr>
+        <w:t>Suma de los 4 puntos del deck (sin 000025-02).</w:t>
       </w:r>
     </w:p>
     <w:tbl>
@@ -429,7 +443,7 @@
                 <w:color w:val="0D3B66"/>
                 <w:sz w:val="22"/>
               </w:rPr>
-              <w:t>1.322,9 m³</w:t>
+              <w:t>1.376,9 m³</w:t>
             </w:r>
           </w:p>
         </w:tc>
@@ -450,7 +464,7 @@
                 <w:color w:val="0D3B66"/>
                 <w:sz w:val="22"/>
               </w:rPr>
-              <w:t>94,5 m³/d</w:t>
+              <w:t>98,3 m³/d</w:t>
             </w:r>
           </w:p>
         </w:tc>
@@ -471,7 +485,7 @@
                 <w:color w:val="0D3B66"/>
                 <w:sz w:val="22"/>
               </w:rPr>
-              <w:t>2.929,3 m³</w:t>
+              <w:t>3.048,8 m³</w:t>
             </w:r>
           </w:p>
         </w:tc>
@@ -771,6 +785,20 @@
           <w:color w:val="0D3B66"/>
           <w:sz w:val="22"/>
         </w:rPr>
+        <w:t>• Impulsión Falabella (000025-09) — activo desde 11/08/2026 (OC / cambio de equipo)</w:t>
+      </w:r>
+    </w:p>
+    <w:p>
+      <w:pPr>
+        <w:pStyle w:val="ListBullet"/>
+        <w:spacing w:after="80" w:before="0"/>
+      </w:pPr>
+      <w:r>
+        <w:rPr>
+          <w:rFonts w:ascii="Calibri" w:hAnsi="Calibri"/>
+          <w:color w:val="0D3B66"/>
+          <w:sz w:val="22"/>
+        </w:rPr>
         <w:t>• Impulsión Ripley (000025-10)</w:t>
       </w:r>
     </w:p>
@@ -800,20 +828,6 @@
           <w:sz w:val="22"/>
         </w:rPr>
         <w:t>• Salida de emergencia pasillo 1 ARROW (000025-33)</w:t>
-      </w:r>
-    </w:p>
-    <w:p>
-      <w:pPr>
-        <w:pStyle w:val="ListBullet"/>
-        <w:spacing w:after="80" w:before="0"/>
-      </w:pPr>
-      <w:r>
-        <w:rPr>
-          <w:rFonts w:ascii="Calibri" w:hAnsi="Calibri"/>
-          <w:color w:val="0D3B66"/>
-          <w:sz w:val="22"/>
-        </w:rPr>
-        <w:t>• Impulsión Falabella (000025-09) — pendiente OC; 4 día(s) con dato en agosto</w:t>
       </w:r>
     </w:p>
     <w:p>
@@ -865,7 +879,7 @@
           <w:color w:val="0D3B66"/>
           <w:sz w:val="22"/>
         </w:rPr>
-        <w:t>Agosto 1–14: 3.288,5 m³  (234,9 m³/día)</w:t>
+        <w:t>Agosto 1–14: 3.583,8 m³  (256 m³/día)</w:t>
       </w:r>
     </w:p>
     <w:p>
@@ -879,7 +893,7 @@
           <w:color w:val="0D3B66"/>
           <w:sz w:val="22"/>
         </w:rPr>
-        <w:t>Proyección agosto: 7.281,6 m³</w:t>
+        <w:t>Proyección agosto: 7.935,5 m³</w:t>
       </w:r>
     </w:p>
     <w:p>
@@ -893,7 +907,7 @@
           <w:color w:val="0D3B66"/>
           <w:sz w:val="22"/>
         </w:rPr>
-        <w:t>Mayor aporte: Placa Bancaria — jun 7.241,6 / jul 7.083,9 / ago 1.918,3 m³</w:t>
+        <w:t>Mayor aporte: Placa Bancaria — jun 7.241,6 / jul 7.083,9 / ago 1.972,1 m³</w:t>
       </w:r>
     </w:p>
     <w:p>
@@ -907,7 +921,7 @@
           <w:color w:val="0D3B66"/>
           <w:sz w:val="22"/>
         </w:rPr>
-        <w:t>Variación m³/día: jul vs jun 0%  ·  ago vs jul -30%</w:t>
+        <w:t>Variación m³/día: jul vs jun 0%  ·  ago vs jul -23%</w:t>
       </w:r>
     </w:p>
     <w:tbl>
@@ -1091,7 +1105,7 @@
                 <w:color w:val="0D3B66"/>
                 <w:sz w:val="22"/>
               </w:rPr>
-              <w:t>3.288,5 m³</w:t>
+              <w:t>3.583,8 m³</w:t>
             </w:r>
           </w:p>
         </w:tc>
@@ -1112,7 +1126,7 @@
                 <w:color w:val="0D3B66"/>
                 <w:sz w:val="22"/>
               </w:rPr>
-              <w:t>234,9 m³/d</w:t>
+              <w:t>256 m³/d</w:t>
             </w:r>
           </w:p>
         </w:tc>
@@ -1133,7 +1147,7 @@
                 <w:color w:val="0D3B66"/>
                 <w:sz w:val="22"/>
               </w:rPr>
-              <w:t>7.281,6 m³</w:t>
+              <w:t>7.935,5 m³</w:t>
             </w:r>
           </w:p>
         </w:tc>
@@ -1196,7 +1210,7 @@
           <w:color w:val="0D3B66"/>
           <w:sz w:val="22"/>
         </w:rPr>
-        <w:t>Placa Bancaria concentra ~69% del volumen monitoreado.</w:t>
+        <w:t>Placa Bancaria concentra ~68% del volumen monitoreado (jun–ago).</w:t>
       </w:r>
     </w:p>
     <w:p>
@@ -1252,7 +1266,7 @@
           <w:color w:val="0D3B66"/>
           <w:sz w:val="22"/>
         </w:rPr>
-        <w:t>Impulsión Falabella: sin dato jun–jul (OC pendiente). Aparecen 4 días desde el 11/08 (24,6 / 55,3 / 66,1 / 12,0 m³) — posible rehabilitación, no consolidada.</w:t>
+        <w:t>Impulsión Falabella (000025-09) ACTIVA desde el 11/08/2026. Jun–jul = 0 (equipo fuera). 11/08 puesta en marcha 24,6 m³ (día parcial). 12–14/08: 55,3 / 66,1 / 24,1 m³. 15–16/08: 120,5 y 112,1 m³/día. Noche 12/08 7,9 m³ y 13/08 13,1 m³ (0–6 h). Sin control; baseline 2–3 semanas.</w:t>
       </w:r>
     </w:p>
     <w:p>
@@ -1276,7 +1290,21 @@
           <w:color w:val="0D3B66"/>
           <w:sz w:val="22"/>
         </w:rPr>
-        <w:t>Confirmar si la OC / cambio de equipo de Impulsión Falabella ya se ejecutó (hay registros desde el 11/08).</w:t>
+        <w:t>Incorporar Impulsión Falabella al tablero diario: ya no está en espera de OC; activo desde el 11/08.</w:t>
+      </w:r>
+    </w:p>
+    <w:p>
+      <w:pPr>
+        <w:pStyle w:val="ListBullet"/>
+        <w:spacing w:after="80" w:before="0"/>
+      </w:pPr>
+      <w:r>
+        <w:rPr>
+          <w:rFonts w:ascii="Calibri" w:hAnsi="Calibri"/>
+          <w:color w:val="0D3B66"/>
+          <w:sz w:val="22"/>
+        </w:rPr>
+        <w:t>No comparar Falabella con junio–julio (serie en cero). Seguir 2–3 semanas para fijar baseline diurno y nocturno.</w:t>
       </w:r>
     </w:p>
     <w:p>
@@ -1343,6 +1371,20 @@
           <w:sz w:val="22"/>
         </w:rPr>
         <w:t>Ripley y Placa: patrón nocturno del deck ya era ~0; se descarta fuga de madrugada.</w:t>
+      </w:r>
+    </w:p>
+    <w:p>
+      <w:pPr>
+        <w:pStyle w:val="ListBullet"/>
+        <w:spacing w:after="80" w:before="0"/>
+      </w:pPr>
+      <w:r>
+        <w:rPr>
+          <w:rFonts w:ascii="Calibri" w:hAnsi="Calibri"/>
+          <w:color w:val="0D3B66"/>
+          <w:sz w:val="22"/>
+        </w:rPr>
+        <w:t>Falabella: las noches desde el 12/08 (8–13 m³ en 0–6 h) NO se descartan; el punto recién entra en medición.</w:t>
       </w:r>
     </w:p>
     <w:p>
@@ -1457,7 +1499,7 @@
           <w:color w:val="0D3B66"/>
           <w:sz w:val="22"/>
         </w:rPr>
-        <w:t>Agosto 1–14: 2.773,8 m³  (198,1 m³/día)</w:t>
+        <w:t>Agosto 1–14: 2.901,3 m³  (207,2 m³/día)</w:t>
       </w:r>
     </w:p>
     <w:p>
@@ -1471,7 +1513,7 @@
           <w:color w:val="0D3B66"/>
           <w:sz w:val="22"/>
         </w:rPr>
-        <w:t>Proyección agosto: 6.142,1 m³</w:t>
+        <w:t>Proyección agosto: 6.424,3 m³</w:t>
       </w:r>
     </w:p>
     <w:p>
@@ -1485,7 +1527,7 @@
           <w:color w:val="0D3B66"/>
           <w:sz w:val="22"/>
         </w:rPr>
-        <w:t>Mayor aporte: Matriz Principal — jun 3.930,8 / jul 5.993,6 / ago 2.730,1 m³</w:t>
+        <w:t>Mayor aporte: Matriz Principal — jun 3.930,8 / jul 5.993,6 / ago 2.854,9 m³</w:t>
       </w:r>
     </w:p>
     <w:p>
@@ -1499,7 +1541,7 @@
           <w:color w:val="0D3B66"/>
           <w:sz w:val="22"/>
         </w:rPr>
-        <w:t>Variación m³/día: jul vs jun 45%  ·  ago vs jul 1%</w:t>
+        <w:t>Variación m³/día: jul vs jun 45%  ·  ago vs jul 6%</w:t>
       </w:r>
     </w:p>
     <w:tbl>
@@ -1683,7 +1725,7 @@
                 <w:color w:val="0D3B66"/>
                 <w:sz w:val="22"/>
               </w:rPr>
-              <w:t>2.773,8 m³</w:t>
+              <w:t>2.901,3 m³</w:t>
             </w:r>
           </w:p>
         </w:tc>
@@ -1704,7 +1746,7 @@
                 <w:color w:val="0D3B66"/>
                 <w:sz w:val="22"/>
               </w:rPr>
-              <w:t>198,1 m³/d</w:t>
+              <w:t>207,2 m³/d</w:t>
             </w:r>
           </w:p>
         </w:tc>
@@ -1725,7 +1767,7 @@
                 <w:color w:val="0D3B66"/>
                 <w:sz w:val="22"/>
               </w:rPr>
-              <w:t>6.142,1 m³</w:t>
+              <w:t>6.424,3 m³</w:t>
             </w:r>
           </w:p>
         </w:tc>
@@ -2049,7 +2091,7 @@
           <w:color w:val="0D3B66"/>
           <w:sz w:val="22"/>
         </w:rPr>
-        <w:t>Agosto 1–14: 2.099,5 m³  (150 m³/día)</w:t>
+        <w:t>Agosto 1–14: 2.180,7 m³  (155,8 m³/día)</w:t>
       </w:r>
     </w:p>
     <w:p>
@@ -2063,7 +2105,7 @@
           <w:color w:val="0D3B66"/>
           <w:sz w:val="22"/>
         </w:rPr>
-        <w:t>Proyección agosto: 4.649 m³</w:t>
+        <w:t>Proyección agosto: 4.828,7 m³</w:t>
       </w:r>
     </w:p>
     <w:p>
@@ -2077,7 +2119,7 @@
           <w:color w:val="0D3B66"/>
           <w:sz w:val="22"/>
         </w:rPr>
-        <w:t>Mayor aporte: San Ignacio 500 — jun 1.415,3 / jul 4.066,5 / ago 1.557 m³</w:t>
+        <w:t>Mayor aporte: San Ignacio 500 — jun 1.415,3 / jul 4.066,5 / ago 1.614 m³</w:t>
       </w:r>
     </w:p>
     <w:p>
@@ -2091,7 +2133,7 @@
           <w:color w:val="0D3B66"/>
           <w:sz w:val="22"/>
         </w:rPr>
-        <w:t>Variación m³/día: jul vs jun 181%  ·  ago vs jul -9%</w:t>
+        <w:t>Variación m³/día: jul vs jun 181%  ·  ago vs jul -6%</w:t>
       </w:r>
     </w:p>
     <w:tbl>
@@ -2275,7 +2317,7 @@
                 <w:color w:val="0D3B66"/>
                 <w:sz w:val="22"/>
               </w:rPr>
-              <w:t>2.099,5 m³</w:t>
+              <w:t>2.180,7 m³</w:t>
             </w:r>
           </w:p>
         </w:tc>
@@ -2296,7 +2338,7 @@
                 <w:color w:val="0D3B66"/>
                 <w:sz w:val="22"/>
               </w:rPr>
-              <w:t>150 m³/d</w:t>
+              <w:t>155,8 m³/d</w:t>
             </w:r>
           </w:p>
         </w:tc>
@@ -2317,7 +2359,7 @@
                 <w:color w:val="0D3B66"/>
                 <w:sz w:val="22"/>
               </w:rPr>
-              <w:t>4.649 m³</w:t>
+              <w:t>4.828,7 m³</w:t>
             </w:r>
           </w:p>
         </w:tc>
@@ -2627,7 +2669,7 @@
           <w:color w:val="0D3B66"/>
           <w:sz w:val="22"/>
         </w:rPr>
-        <w:t>Agosto 1–14: 968,3 m³  (69,2 m³/día)</w:t>
+        <w:t>Agosto 1–14: 1.004,8 m³  (71,8 m³/día)</w:t>
       </w:r>
     </w:p>
     <w:p>
@@ -2641,7 +2683,7 @@
           <w:color w:val="0D3B66"/>
           <w:sz w:val="22"/>
         </w:rPr>
-        <w:t>Proyección agosto: 2.144,1 m³</w:t>
+        <w:t>Proyección agosto: 2.225 m³</w:t>
       </w:r>
     </w:p>
     <w:p>
@@ -2655,7 +2697,7 @@
           <w:color w:val="0D3B66"/>
           <w:sz w:val="22"/>
         </w:rPr>
-        <w:t>Mayor aporte: Matriz principal 1°piso — jun 1.651,6 / jul 1.724,2 / ago 785,5 m³</w:t>
+        <w:t>Mayor aporte: Matriz principal 1°piso — jun 1.651,6 / jul 1.724,2 / ago 818,8 m³</w:t>
       </w:r>
     </w:p>
     <w:p>
@@ -2669,7 +2711,7 @@
           <w:color w:val="0D3B66"/>
           <w:sz w:val="22"/>
         </w:rPr>
-        <w:t>Variación m³/día: jul vs jun 8%  ·  ago vs jul -10%</w:t>
+        <w:t>Variación m³/día: jul vs jun 8%  ·  ago vs jul -6%</w:t>
       </w:r>
     </w:p>
     <w:tbl>
@@ -2853,7 +2895,7 @@
                 <w:color w:val="0D3B66"/>
                 <w:sz w:val="22"/>
               </w:rPr>
-              <w:t>968,3 m³</w:t>
+              <w:t>1.004,8 m³</w:t>
             </w:r>
           </w:p>
         </w:tc>
@@ -2874,7 +2916,7 @@
                 <w:color w:val="0D3B66"/>
                 <w:sz w:val="22"/>
               </w:rPr>
-              <w:t>69,2 m³/d</w:t>
+              <w:t>71,8 m³/d</w:t>
             </w:r>
           </w:p>
         </w:tc>
@@ -2895,7 +2937,7 @@
                 <w:color w:val="0D3B66"/>
                 <w:sz w:val="22"/>
               </w:rPr>
-              <w:t>2.144,1 m³</w:t>
+              <w:t>2.225 m³</w:t>
             </w:r>
           </w:p>
         </w:tc>
@@ -2972,7 +3014,7 @@
           <w:color w:val="0D3B66"/>
           <w:sz w:val="22"/>
         </w:rPr>
-        <w:t>Matriz 11: jun 1.651,6 / jul 1.724,2 / ago 785,5 m³ (~55 m³/día, estable).</w:t>
+        <w:t>Matriz 11: jun 1.651,6 / jul 1.724,2 / ago 818,8 m³ (~55 m³/día, estable).</w:t>
       </w:r>
     </w:p>
     <w:p>
@@ -3219,7 +3261,7 @@
           <w:color w:val="0D3B66"/>
           <w:sz w:val="22"/>
         </w:rPr>
-        <w:t>Agosto 1–14: 294 m³  (21 m³/día)</w:t>
+        <w:t>Agosto 1–14: 304,3 m³  (21,7 m³/día)</w:t>
       </w:r>
     </w:p>
     <w:p>
@@ -3233,7 +3275,7 @@
           <w:color w:val="0D3B66"/>
           <w:sz w:val="22"/>
         </w:rPr>
-        <w:t>Proyección agosto: 651,1 m³</w:t>
+        <w:t>Proyección agosto: 673,9 m³</w:t>
       </w:r>
     </w:p>
     <w:p>
@@ -3247,7 +3289,7 @@
           <w:color w:val="0D3B66"/>
           <w:sz w:val="22"/>
         </w:rPr>
-        <w:t>Mayor aporte: CUR Anillo Sur — jun 342,3 / jul 331,9 / ago 154,2 m³</w:t>
+        <w:t>Mayor aporte: CUR Anillo Sur — jun 342,3 / jul 331,9 / ago 159,2 m³</w:t>
       </w:r>
     </w:p>
     <w:p>
@@ -3261,7 +3303,7 @@
           <w:color w:val="0D3B66"/>
           <w:sz w:val="22"/>
         </w:rPr>
-        <w:t>Variación m³/día: jul vs jun -10%  ·  ago vs jul 5%</w:t>
+        <w:t>Variación m³/día: jul vs jun -10%  ·  ago vs jul 9%</w:t>
       </w:r>
     </w:p>
     <w:tbl>
@@ -3445,7 +3487,7 @@
                 <w:color w:val="0D3B66"/>
                 <w:sz w:val="22"/>
               </w:rPr>
-              <w:t>294 m³</w:t>
+              <w:t>304,3 m³</w:t>
             </w:r>
           </w:p>
         </w:tc>
@@ -3466,7 +3508,7 @@
                 <w:color w:val="0D3B66"/>
                 <w:sz w:val="22"/>
               </w:rPr>
-              <w:t>21 m³/d</w:t>
+              <w:t>21,7 m³/d</w:t>
             </w:r>
           </w:p>
         </w:tc>
@@ -3487,7 +3529,7 @@
                 <w:color w:val="0D3B66"/>
                 <w:sz w:val="22"/>
               </w:rPr>
-              <w:t>651,1 m³</w:t>
+              <w:t>673,9 m³</w:t>
             </w:r>
           </w:p>
         </w:tc>
@@ -3564,7 +3606,7 @@
           <w:color w:val="0D3B66"/>
           <w:sz w:val="22"/>
         </w:rPr>
-        <w:t>Volumen conjunto estable: jun 663,8 / jul 618,5 / ago 294 m³ (~20–22 m³/día).</w:t>
+        <w:t>Volumen conjunto estable: jun 663,8 / jul 618,5 / ago 304,3 m³ (~20–22 m³/día).</w:t>
       </w:r>
     </w:p>
     <w:p>
@@ -3909,7 +3951,7 @@
           <w:color w:val="0D3B66"/>
           <w:sz w:val="22"/>
         </w:rPr>
-        <w:t>Agosto 1–14: 17.265,4 m³  (1.233,2 m³/día)</w:t>
+        <w:t>Agosto 1–14: 17.879,2 m³  (1.277,1 m³/día)</w:t>
       </w:r>
     </w:p>
     <w:p>
@@ -3923,7 +3965,7 @@
           <w:color w:val="0D3B66"/>
           <w:sz w:val="22"/>
         </w:rPr>
-        <w:t>Proyección agosto: 38.230,5 m³</w:t>
+        <w:t>Proyección agosto: 39.589,7 m³</w:t>
       </w:r>
     </w:p>
     <w:p>
@@ -3951,7 +3993,7 @@
           <w:color w:val="0D3B66"/>
           <w:sz w:val="22"/>
         </w:rPr>
-        <w:t>Mayor cabecera: Sala de Bomba Sandia Antigua — jun 8.532,6 / jul 13.661,2 / ago 7.264,4 m³</w:t>
+        <w:t>Mayor cabecera: Sala de Bomba Sandia Antigua — jun 8.532,6 / jul 13.661,2 / ago 7.497,6 m³</w:t>
       </w:r>
     </w:p>
     <w:p>
@@ -3965,7 +4007,7 @@
           <w:color w:val="0D3B66"/>
           <w:sz w:val="22"/>
         </w:rPr>
-        <w:t>Variación m³/día: jul vs jun 44%  ·  ago vs jul 22%</w:t>
+        <w:t>Variación m³/día: jul vs jun 44%  ·  ago vs jul 27%</w:t>
       </w:r>
     </w:p>
     <w:tbl>
@@ -4149,7 +4191,7 @@
                 <w:color w:val="0D3B66"/>
                 <w:sz w:val="22"/>
               </w:rPr>
-              <w:t>17.265,4 m³</w:t>
+              <w:t>17.879,2 m³</w:t>
             </w:r>
           </w:p>
         </w:tc>
@@ -4170,7 +4212,7 @@
                 <w:color w:val="0D3B66"/>
                 <w:sz w:val="22"/>
               </w:rPr>
-              <w:t>1.233,2 m³/d</w:t>
+              <w:t>1.277,1 m³/d</w:t>
             </w:r>
           </w:p>
         </w:tc>
@@ -4191,7 +4233,7 @@
                 <w:color w:val="0D3B66"/>
                 <w:sz w:val="22"/>
               </w:rPr>
-              <w:t>38.230,5 m³</w:t>
+              <w:t>39.589,7 m³</w:t>
             </w:r>
           </w:p>
         </w:tc>
@@ -4282,7 +4324,7 @@
           <w:color w:val="0D3B66"/>
           <w:sz w:val="22"/>
         </w:rPr>
-        <w:t>Consumo de cabecera (sin doble conteo): jun 20.927,5 / jul 31.239 / ago 17.265,4 m³.</w:t>
+        <w:t>Consumo de cabecera (sin doble conteo): jun 20.927,5 / jul 31.239 / ago 17.879,2 m³.</w:t>
       </w:r>
     </w:p>
     <w:p>
@@ -4641,7 +4683,7 @@
                 <w:color w:val="0D3B66"/>
                 <w:sz w:val="18"/>
               </w:rPr>
-              <w:t>1.323</w:t>
+              <w:t>1.377</w:t>
             </w:r>
           </w:p>
         </w:tc>
@@ -4662,7 +4704,7 @@
                 <w:color w:val="0D3B66"/>
                 <w:sz w:val="18"/>
               </w:rPr>
-              <w:t>94,5</w:t>
+              <w:t>98,3</w:t>
             </w:r>
           </w:p>
         </w:tc>
@@ -4769,7 +4811,7 @@
                 <w:color w:val="0D3B66"/>
                 <w:sz w:val="18"/>
               </w:rPr>
-              <w:t>3.288</w:t>
+              <w:t>3.584</w:t>
             </w:r>
           </w:p>
         </w:tc>
@@ -4790,7 +4832,7 @@
                 <w:color w:val="0D3B66"/>
                 <w:sz w:val="18"/>
               </w:rPr>
-              <w:t>234,9</w:t>
+              <w:t>256</w:t>
             </w:r>
           </w:p>
         </w:tc>
@@ -4811,7 +4853,7 @@
                 <w:color w:val="0D3B66"/>
                 <w:sz w:val="18"/>
               </w:rPr>
-              <w:t>Placa se revirtió. Confirmar OC Falabella (dato desde 11/08).</w:t>
+              <w:t>Placa se revirtió. Falabella activa desde el 11/08.</w:t>
             </w:r>
           </w:p>
         </w:tc>
@@ -4897,7 +4939,7 @@
                 <w:color w:val="0D3B66"/>
                 <w:sz w:val="18"/>
               </w:rPr>
-              <w:t>2.774</w:t>
+              <w:t>2.901</w:t>
             </w:r>
           </w:p>
         </w:tc>
@@ -4918,7 +4960,7 @@
                 <w:color w:val="0D3B66"/>
                 <w:sz w:val="18"/>
               </w:rPr>
-              <w:t>198,1</w:t>
+              <w:t>207,2</w:t>
             </w:r>
           </w:p>
         </w:tc>
@@ -5025,7 +5067,7 @@
                 <w:color w:val="0D3B66"/>
                 <w:sz w:val="18"/>
               </w:rPr>
-              <w:t>2.100</w:t>
+              <w:t>2.181</w:t>
             </w:r>
           </w:p>
         </w:tc>
@@ -5046,7 +5088,7 @@
                 <w:color w:val="0D3B66"/>
                 <w:sz w:val="18"/>
               </w:rPr>
-              <w:t>150</w:t>
+              <w:t>155,8</w:t>
             </w:r>
           </w:p>
         </w:tc>
@@ -5153,7 +5195,7 @@
                 <w:color w:val="0D3B66"/>
                 <w:sz w:val="18"/>
               </w:rPr>
-              <w:t>968</w:t>
+              <w:t>1.005</w:t>
             </w:r>
           </w:p>
         </w:tc>
@@ -5174,7 +5216,7 @@
                 <w:color w:val="0D3B66"/>
                 <w:sz w:val="18"/>
               </w:rPr>
-              <w:t>69,2</w:t>
+              <w:t>71,8</w:t>
             </w:r>
           </w:p>
         </w:tc>
@@ -5281,7 +5323,7 @@
                 <w:color w:val="0D3B66"/>
                 <w:sz w:val="18"/>
               </w:rPr>
-              <w:t>294</w:t>
+              <w:t>304</w:t>
             </w:r>
           </w:p>
         </w:tc>
@@ -5302,7 +5344,7 @@
                 <w:color w:val="0D3B66"/>
                 <w:sz w:val="18"/>
               </w:rPr>
-              <w:t>21</w:t>
+              <w:t>21,7</w:t>
             </w:r>
           </w:p>
         </w:tc>
@@ -5409,7 +5451,7 @@
                 <w:color w:val="0D3B66"/>
                 <w:sz w:val="18"/>
               </w:rPr>
-              <w:t>17.265</w:t>
+              <w:t>17.879</w:t>
             </w:r>
           </w:p>
         </w:tc>
@@ -5430,7 +5472,7 @@
                 <w:color w:val="0D3B66"/>
                 <w:sz w:val="18"/>
               </w:rPr>
-              <w:t>1.233,2</w:t>
+              <w:t>1.277,1</w:t>
             </w:r>
           </w:p>
         </w:tc>

</xml_diff>

<commit_message>
Clarify MAE point 5: night with control is not a leak
Replace the ambiguous DESCARTADO label with 'noche con control:
no se lee como fuga' so the control itself is not read as discarded.

Co-authored-by: anibaloperacionesWes <anibaloperacionesWes@users.noreply.github.com>
</commit_message>
<xml_diff>
--- a/reports/Parque_Arauco/TMP_7MALLS/entrega_diego_anibal/Fichas_ejecutivas_Parque_Arauco_20260814.docx
+++ b/reports/Parque_Arauco/TMP_7MALLS/entrega_diego_anibal/Fichas_ejecutivas_Parque_Arauco_20260814.docx
@@ -30,7 +30,7 @@
           <w:rFonts w:ascii="Calibri" w:hAnsi="Calibri"/>
           <w:sz w:val="22"/>
         </w:rPr>
-        <w:t>Período 01/06/2026 – 14/08/2026. Emisión 14 agosto 2026. Cinco variables por mall: equipos instalados, consumo mensualizado de los puntos WES, hallazgos, solicitudes, y controles nocturnos (descartados como fuga). Alineado al PPT 7 Malls de la carpeta entrega_diego_anibal, con datos junio–agosto.</w:t>
+        <w:t>Período 01/06/2026 – 14/08/2026. Emisión 14 agosto 2026. Cinco variables por mall: equipos instalados, consumo mensualizado de los puntos WES, hallazgos, solicitudes, y noche con control (no se lee como fuga). Alineado al PPT 7 Malls de la carpeta entrega_diego_anibal, con datos junio–agosto.</w:t>
       </w:r>
     </w:p>
     <w:p>
@@ -40,7 +40,7 @@
           <w:color w:val="0D3B66"/>
           <w:sz w:val="22"/>
         </w:rPr>
-        <w:t xml:space="preserve">Controles nocturnos descartados en todo el informe: </w:t>
+        <w:t xml:space="preserve">Noche con control: no se lee como fuga. </w:t>
       </w:r>
       <w:r>
         <w:rPr>
@@ -562,7 +562,7 @@
           <w:color w:val="0D3B66"/>
           <w:sz w:val="22"/>
         </w:rPr>
-        <w:t>Pizza Hut: control nocturno desde 01/07 funciona (noche ~0 m³ el 10/08). El alza de julio (23,8 → 37,7 m³/día) es diurna; agosto baja a 14,1 m³/día. Noche descartada.</w:t>
+        <w:t>Pizza Hut: control nocturno desde 01/07 funciona (noche ~0 m³ el 10/08). El alza de julio (23,8 → 37,7 m³/día) es diurna; agosto baja a 14,1 m³/día. Esa noche no se lee como fuga.</w:t>
       </w:r>
     </w:p>
     <w:p>
@@ -666,7 +666,7 @@
           <w:color w:val="C9A227"/>
           <w:sz w:val="26"/>
         </w:rPr>
-        <w:t>5. Controles nocturnos (descartados del análisis de fugas)</w:t>
+        <w:t>5. Noche con control: no se lee como fuga</w:t>
       </w:r>
     </w:p>
     <w:p>
@@ -680,7 +680,7 @@
           <w:color w:val="0D3B66"/>
           <w:sz w:val="22"/>
         </w:rPr>
-        <w:t>Estanque Sur (000025-19): corte on/off a cargo de personal de mantención nocturno — DESCARTADO.</w:t>
+        <w:t>Estanque Sur (000025-19): corte on/off de mantención nocturna. La madrugada NO se lee como fuga.</w:t>
       </w:r>
     </w:p>
     <w:p>
@@ -694,7 +694,7 @@
           <w:color w:val="0D3B66"/>
           <w:sz w:val="22"/>
         </w:rPr>
-        <w:t>Pizza Hut (000025-07): control nocturno desde 01/07/2026 (00:00–06:00) — DESCARTADO. Verificado 10/08: 0 m³ en 0–6 h.</w:t>
+        <w:t>Pizza Hut (000025-07): control 00:00–06:00 desde 01/07. Noche OK (10/08: 0 m³). No se lee como fuga.</w:t>
       </w:r>
     </w:p>
     <w:p>
@@ -708,7 +708,7 @@
           <w:color w:val="0D3B66"/>
           <w:sz w:val="22"/>
         </w:rPr>
-        <w:t>Estanque Norte (000025-01): control nocturno desde 05/08/2026 — DESCARTADO.</w:t>
+        <w:t>Estanque Norte (000025-01): control desde 05/08. La madrugada NO se lee como fuga (el alza de agosto es diurna).</w:t>
       </w:r>
     </w:p>
     <w:p>
@@ -722,7 +722,7 @@
           <w:color w:val="0D3B66"/>
           <w:sz w:val="22"/>
         </w:rPr>
-        <w:t>Baños Públicos: control instalado sin funcionamiento; noches ya ~0 — no se interpreta como fuga.</w:t>
+        <w:t>Baños Públicos: control instalado sin uso; noches ya ~0. Tampoco se interpreta como fuga.</w:t>
       </w:r>
     </w:p>
     <w:p>
@@ -1342,7 +1342,7 @@
           <w:color w:val="C9A227"/>
           <w:sz w:val="26"/>
         </w:rPr>
-        <w:t>5. Controles nocturnos (descartados del análisis de fugas)</w:t>
+        <w:t>5. Noche con control: no se lee como fuga</w:t>
       </w:r>
     </w:p>
     <w:p>
@@ -1948,7 +1948,7 @@
           <w:color w:val="C9A227"/>
           <w:sz w:val="26"/>
         </w:rPr>
-        <w:t>5. Controles nocturnos (descartados del análisis de fugas)</w:t>
+        <w:t>5. Noche con control: no se lee como fuga</w:t>
       </w:r>
     </w:p>
     <w:p>
@@ -2526,7 +2526,7 @@
           <w:color w:val="C9A227"/>
           <w:sz w:val="26"/>
         </w:rPr>
-        <w:t>5. Controles nocturnos (descartados del análisis de fugas)</w:t>
+        <w:t>5. Noche con control: no se lee como fuga</w:t>
       </w:r>
     </w:p>
     <w:p>
@@ -2540,7 +2540,7 @@
           <w:color w:val="0D3B66"/>
           <w:sz w:val="22"/>
         </w:rPr>
-        <w:t>San Ignacio 500 (000025-18): control nocturno desde 16/07/2026 — DESCARTADO (verificado: noche 42 → 2 m³).</w:t>
+        <w:t>San Ignacio 500 (000025-18): control desde 16/07. Noche 42 → 2 m³. Esa madrugada NO se lee como fuga.</w:t>
       </w:r>
     </w:p>
     <w:p>
@@ -2554,7 +2554,7 @@
           <w:color w:val="0D3B66"/>
           <w:sz w:val="22"/>
         </w:rPr>
-        <w:t>San Ignacio 300: sin control. No se descarta.</w:t>
+        <w:t>San Ignacio 300: sin control. La noche SÍ entra al análisis (el 10/08 fue ~51% nocturna).</w:t>
       </w:r>
     </w:p>
     <w:p>
@@ -3118,7 +3118,7 @@
           <w:color w:val="C9A227"/>
           <w:sz w:val="26"/>
         </w:rPr>
-        <w:t>5. Controles nocturnos (descartados del análisis de fugas)</w:t>
+        <w:t>5. Noche con control: no se lee como fuga</w:t>
       </w:r>
     </w:p>
     <w:p>
@@ -3696,7 +3696,7 @@
           <w:color w:val="C9A227"/>
           <w:sz w:val="26"/>
         </w:rPr>
-        <w:t>5. Controles nocturnos (descartados del análisis de fugas)</w:t>
+        <w:t>5. Noche con control: no se lee como fuga</w:t>
       </w:r>
     </w:p>
     <w:p>
@@ -4414,7 +4414,7 @@
           <w:color w:val="C9A227"/>
           <w:sz w:val="26"/>
         </w:rPr>
-        <w:t>5. Controles nocturnos (descartados del análisis de fugas)</w:t>
+        <w:t>5. Noche con control: no se lee como fuga</w:t>
       </w:r>
     </w:p>
     <w:p>
@@ -4725,7 +4725,7 @@
                 <w:color w:val="0D3B66"/>
                 <w:sz w:val="18"/>
               </w:rPr>
-              <w:t>Descartar noches Norte/Pizza/Sur. Norte: alza diurna agosto.</w:t>
+              <w:t>Norte/Pizza/Sur: noche con control, no es fuga. Norte: alza diurna agosto.</w:t>
             </w:r>
           </w:p>
         </w:tc>

</xml_diff>